<commit_message>
docs: alphabetize author order
</commit_message>
<xml_diff>
--- a/outputs/report/template-docx/template.docx
+++ b/outputs/report/template-docx/template.docx
@@ -118,7 +118,7 @@
           <w:rFonts w:ascii="Palatino" w:hAnsi="Palatino"/>
           <w:sz w:val="24"/>
         </w:rPr>
-        <w:t>Rafael Schiozer</w:t>
+        <w:t>Matheus L. Carrijo</w:t>
       </w:r>
       <w:r>
         <w:br/>
@@ -128,7 +128,7 @@
           <w:rFonts w:ascii="Palatino" w:hAnsi="Palatino"/>
           <w:sz w:val="24"/>
         </w:rPr>
-        <w:t>Matheus L. Carrijo</w:t>
+        <w:t>Rafael Schiozer</w:t>
       </w:r>
     </w:p>
     <w:p>
@@ -1560,7 +1560,7 @@
           <w:b w:val="0"/>
           <w:i w:val="0"/>
         </w:rPr>
-        <w:t xml:space="preserve">Citação recomendada. Gonzalez, L.; Schiozer, R.; Carrijo, M. L. </w:t>
+        <w:t xml:space="preserve">Citação recomendada. Gonzalez, L.; Carrijo, M. L.; Schiozer, R. </w:t>
       </w:r>
       <w:r>
         <w:rPr>

</xml_diff>